<commit_message>
Proposal v2 (cover band, page numbers, contents, doc control) + Turkish translation
Template fixes: full-width signal-green cover band, footer with live
'Page X of Y' fields (suppressed on the cover), a contents page with a
note on inserting a live TOC in Google Docs, and a document-control table
(version/date/status/contact). Turkish version produced with the DeepL
document API, preserving all formatting, tables, and screenshots.
.env added to .gitignore (API keys never enter the repository).

Co-Authored-By: Claude Fable 5 <noreply@anthropic.com>
Claude-Session: https://claude.ai/code/session_0159dhhnJ6cFi6rrwV8XwqLF
</commit_message>
<xml_diff>
--- a/docs/Smart_Traffic_Pilot_Proposal.docx
+++ b/docs/Smart_Traffic_Pilot_Proposal.docx
@@ -5,18 +5,23 @@
     <w:p/>
     <w:p/>
     <w:p/>
-    <w:p/>
-    <w:p/>
     <w:p>
       <w:pPr>
         <w:jc w:val="center"/>
+        <w:shd w:val="clear" w:fill="1A5E20"/>
+      </w:pPr>
+    </w:p>
+    <w:p>
+      <w:pPr>
+        <w:jc w:val="center"/>
+        <w:shd w:val="clear" w:fill="1A5E20"/>
       </w:pPr>
       <w:r>
         <w:rPr>
           <w:b/>
           <w:i w:val="0"/>
-          <w:color w:val="1A5E20"/>
-          <w:sz w:val="64"/>
+          <w:color w:val="FFFFFF"/>
+          <w:sz w:val="60"/>
         </w:rPr>
         <w:t>Adaptive Traffic Signals Pilot</w:t>
       </w:r>
@@ -24,13 +29,14 @@
     <w:p>
       <w:pPr>
         <w:jc w:val="center"/>
+        <w:shd w:val="clear" w:fill="1A5E20"/>
       </w:pPr>
       <w:r>
         <w:rPr>
           <w:b w:val="0"/>
           <w:i w:val="0"/>
-          <w:color w:val="212121"/>
-          <w:sz w:val="32"/>
+          <w:color w:val="FFFFFF"/>
+          <w:sz w:val="30"/>
         </w:rPr>
         <w:t>Camera-Based, Demand-Actuated Signal Control</w:t>
       </w:r>
@@ -38,18 +44,24 @@
     <w:p>
       <w:pPr>
         <w:jc w:val="center"/>
+        <w:shd w:val="clear" w:fill="1A5E20"/>
       </w:pPr>
       <w:r>
         <w:rPr>
           <w:b w:val="0"/>
           <w:i w:val="0"/>
-          <w:color w:val="5F6A6A"/>
-          <w:sz w:val="26"/>
+          <w:color w:val="FFFFFF"/>
+          <w:sz w:val="24"/>
         </w:rPr>
         <w:t>Project Proposal</w:t>
       </w:r>
     </w:p>
-    <w:p/>
+    <w:p>
+      <w:pPr>
+        <w:jc w:val="center"/>
+        <w:shd w:val="clear" w:fill="1A5E20"/>
+      </w:pPr>
+    </w:p>
     <w:p/>
     <w:p/>
     <w:p>
@@ -72,7 +84,7 @@
                     <pic:cNvPicPr/>
                   </pic:nvPicPr>
                   <pic:blipFill>
-                    <a:blip r:embed="rId9"/>
+                    <a:blip r:embed="rId10"/>
                     <a:stretch>
                       <a:fillRect/>
                     </a:stretch>
@@ -119,18 +131,288 @@
         <w:t>Prepared by: Erenus Yildiz</w:t>
       </w:r>
     </w:p>
+    <w:p/>
+    <w:tbl>
+      <w:tblPr>
+        <w:tblStyle w:val="TableGrid"/>
+        <w:tblW w:type="auto" w:w="0"/>
+        <w:jc w:val="center"/>
+        <w:tblLook w:firstColumn="1" w:firstRow="1" w:lastColumn="0" w:lastRow="0" w:noHBand="0" w:noVBand="1" w:val="04A0"/>
+      </w:tblPr>
+      <w:tblGrid>
+        <w:gridCol w:w="2160"/>
+        <w:gridCol w:w="2160"/>
+        <w:gridCol w:w="2160"/>
+        <w:gridCol w:w="2160"/>
+      </w:tblGrid>
+      <w:tr>
+        <w:tc>
+          <w:tcPr>
+            <w:tcW w:type="dxa" w:w="1152"/>
+          </w:tcPr>
+          <w:p>
+            <w:r/>
+            <w:r>
+              <w:rPr>
+                <w:b/>
+                <w:color w:val="1A5E20"/>
+                <w:sz w:val="20"/>
+              </w:rPr>
+              <w:t>Version</w:t>
+            </w:r>
+          </w:p>
+        </w:tc>
+        <w:tc>
+          <w:tcPr>
+            <w:tcW w:type="dxa" w:w="1728"/>
+          </w:tcPr>
+          <w:p>
+            <w:r/>
+            <w:r>
+              <w:rPr>
+                <w:b/>
+                <w:color w:val="1A5E20"/>
+                <w:sz w:val="20"/>
+              </w:rPr>
+              <w:t>Date</w:t>
+            </w:r>
+          </w:p>
+        </w:tc>
+        <w:tc>
+          <w:tcPr>
+            <w:tcW w:type="dxa" w:w="1584"/>
+          </w:tcPr>
+          <w:p>
+            <w:r/>
+            <w:r>
+              <w:rPr>
+                <w:b/>
+                <w:color w:val="1A5E20"/>
+                <w:sz w:val="20"/>
+              </w:rPr>
+              <w:t>Status</w:t>
+            </w:r>
+          </w:p>
+        </w:tc>
+        <w:tc>
+          <w:tcPr>
+            <w:tcW w:type="dxa" w:w="4896"/>
+          </w:tcPr>
+          <w:p>
+            <w:r/>
+            <w:r>
+              <w:rPr>
+                <w:b/>
+                <w:color w:val="1A5E20"/>
+                <w:sz w:val="20"/>
+              </w:rPr>
+              <w:t>Contact</w:t>
+            </w:r>
+          </w:p>
+        </w:tc>
+      </w:tr>
+      <w:tr>
+        <w:tc>
+          <w:tcPr>
+            <w:tcW w:type="dxa" w:w="1152"/>
+          </w:tcPr>
+          <w:p>
+            <w:r/>
+            <w:r>
+              <w:rPr>
+                <w:sz w:val="20"/>
+              </w:rPr>
+              <w:t>1.0</w:t>
+            </w:r>
+          </w:p>
+        </w:tc>
+        <w:tc>
+          <w:tcPr>
+            <w:tcW w:type="dxa" w:w="1728"/>
+          </w:tcPr>
+          <w:p>
+            <w:r/>
+            <w:r>
+              <w:rPr>
+                <w:sz w:val="20"/>
+              </w:rPr>
+              <w:t>August 2026</w:t>
+            </w:r>
+          </w:p>
+        </w:tc>
+        <w:tc>
+          <w:tcPr>
+            <w:tcW w:type="dxa" w:w="1584"/>
+          </w:tcPr>
+          <w:p>
+            <w:r/>
+            <w:r>
+              <w:rPr>
+                <w:sz w:val="20"/>
+              </w:rPr>
+              <w:t>For review</w:t>
+            </w:r>
+          </w:p>
+        </w:tc>
+        <w:tc>
+          <w:tcPr>
+            <w:tcW w:type="dxa" w:w="4896"/>
+          </w:tcPr>
+          <w:p>
+            <w:r/>
+            <w:r>
+              <w:rPr>
+                <w:sz w:val="20"/>
+              </w:rPr>
+              <w:t>[contact e-mail]  ·  github.com/eyildiz-ugoe/smart-traffic</w:t>
+            </w:r>
+          </w:p>
+        </w:tc>
+      </w:tr>
+    </w:tbl>
+    <w:p/>
+    <w:p>
+      <w:r>
+        <w:br w:type="page"/>
+      </w:r>
+    </w:p>
     <w:p>
       <w:pPr>
-        <w:jc w:val="center"/>
+        <w:pStyle w:val="Heading1"/>
       </w:pPr>
+      <w:r>
+        <w:t>Contents</w:t>
+      </w:r>
+    </w:p>
+    <w:p>
+      <w:pPr>
+        <w:pStyle w:val="ListBullet"/>
+      </w:pPr>
+      <w:r>
+        <w:t>Executive Summary</w:t>
+      </w:r>
+    </w:p>
+    <w:p>
+      <w:pPr>
+        <w:pStyle w:val="ListBullet"/>
+      </w:pPr>
+      <w:r>
+        <w:t>1. The Problem: Signals That Cannot See</w:t>
+      </w:r>
+    </w:p>
+    <w:p>
+      <w:pPr>
+        <w:pStyle w:val="ListBullet"/>
+      </w:pPr>
+      <w:r>
+        <w:t>2. The Proposed Solution</w:t>
+      </w:r>
+    </w:p>
+    <w:p>
+      <w:pPr>
+        <w:pStyle w:val="ListBullet"/>
+      </w:pPr>
+      <w:r>
+        <w:t>3. What Has Already Been Built</w:t>
+      </w:r>
+    </w:p>
+    <w:p>
+      <w:pPr>
+        <w:pStyle w:val="ListBullet"/>
+      </w:pPr>
+      <w:r>
+        <w:t>4. Technology and Architecture</w:t>
+      </w:r>
+    </w:p>
+    <w:p>
+      <w:pPr>
+        <w:pStyle w:val="ListBullet"/>
+      </w:pPr>
+      <w:r>
+        <w:t>5. Engineering Rigor and Validation</w:t>
+      </w:r>
+    </w:p>
+    <w:p>
+      <w:pPr>
+        <w:pStyle w:val="ListBullet"/>
+      </w:pPr>
+      <w:r>
+        <w:t>6. Current Limitations — Stated Plainly</w:t>
+      </w:r>
+    </w:p>
+    <w:p>
+      <w:pPr>
+        <w:pStyle w:val="ListBullet"/>
+      </w:pPr>
+      <w:r>
+        <w:t>7. Pilot Plan and Timeline</w:t>
+      </w:r>
+    </w:p>
+    <w:p>
+      <w:pPr>
+        <w:pStyle w:val="ListBullet"/>
+      </w:pPr>
+      <w:r>
+        <w:t>8. Expected Benefits and How They Will Be Measured</w:t>
+      </w:r>
+    </w:p>
+    <w:p>
+      <w:pPr>
+        <w:pStyle w:val="ListBullet"/>
+      </w:pPr>
+      <w:r>
+        <w:t>9. Budget Framework</w:t>
+      </w:r>
+    </w:p>
+    <w:p>
+      <w:pPr>
+        <w:pStyle w:val="ListBullet"/>
+      </w:pPr>
+      <w:r>
+        <w:t>10. Risk Management</w:t>
+      </w:r>
+    </w:p>
+    <w:p>
+      <w:pPr>
+        <w:pStyle w:val="ListBullet"/>
+      </w:pPr>
+      <w:r>
+        <w:t>11. Team and Governance</w:t>
+      </w:r>
+    </w:p>
+    <w:p>
+      <w:pPr>
+        <w:pStyle w:val="ListBullet"/>
+      </w:pPr>
+      <w:r>
+        <w:t>12. References</w:t>
+      </w:r>
+    </w:p>
+    <w:p>
+      <w:pPr>
+        <w:pStyle w:val="ListBullet"/>
+      </w:pPr>
+      <w:r>
+        <w:t>Appendix A — Running the Demonstration</w:t>
+      </w:r>
+    </w:p>
+    <w:p>
+      <w:pPr>
+        <w:pStyle w:val="ListBullet"/>
+      </w:pPr>
+      <w:r>
+        <w:t>Appendix B — Glossary</w:t>
+      </w:r>
+    </w:p>
+    <w:p>
       <w:r>
         <w:rPr>
           <w:b w:val="0"/>
-          <w:i w:val="0"/>
+          <w:i/>
           <w:color w:val="5F6A6A"/>
-          <w:sz w:val="20"/>
+          <w:sz w:val="18"/>
         </w:rPr>
-        <w:t>Date: August 2026  |  Repository: github.com/eyildiz-ugoe/smart-traffic</w:t>
+        <w:t>Tip: after importing into Google Docs, Insert → Table of contents replaces this list with a live, page-numbered TOC that follows your edits.</w:t>
       </w:r>
     </w:p>
     <w:p>
@@ -495,7 +777,7 @@
                     <pic:cNvPicPr/>
                   </pic:nvPicPr>
                   <pic:blipFill>
-                    <a:blip r:embed="rId10"/>
+                    <a:blip r:embed="rId11"/>
                     <a:stretch>
                       <a:fillRect/>
                     </a:stretch>
@@ -547,7 +829,7 @@
                     <pic:cNvPicPr/>
                   </pic:nvPicPr>
                   <pic:blipFill>
-                    <a:blip r:embed="rId11"/>
+                    <a:blip r:embed="rId12"/>
                     <a:stretch>
                       <a:fillRect/>
                     </a:stretch>
@@ -616,7 +898,7 @@
                     <pic:cNvPicPr/>
                   </pic:nvPicPr>
                   <pic:blipFill>
-                    <a:blip r:embed="rId12"/>
+                    <a:blip r:embed="rId13"/>
                     <a:stretch>
                       <a:fillRect/>
                     </a:stretch>
@@ -685,7 +967,7 @@
                     <pic:cNvPicPr/>
                   </pic:nvPicPr>
                   <pic:blipFill>
-                    <a:blip r:embed="rId13"/>
+                    <a:blip r:embed="rId14"/>
                     <a:stretch>
                       <a:fillRect/>
                     </a:stretch>
@@ -754,7 +1036,7 @@
                     <pic:cNvPicPr/>
                   </pic:nvPicPr>
                   <pic:blipFill>
-                    <a:blip r:embed="rId14"/>
+                    <a:blip r:embed="rId15"/>
                     <a:stretch>
                       <a:fillRect/>
                     </a:stretch>
@@ -4198,13 +4480,82 @@
       </w:r>
     </w:p>
     <w:sectPr>
+      <w:footerReference w:type="default" r:id="rId9"/>
       <w:pgSz w:w="12240" w:h="15840"/>
       <w:pgMar w:top="1440" w:right="1800" w:bottom="1440" w:left="1800" w:header="720" w:footer="720" w:gutter="0"/>
       <w:cols w:space="720"/>
+      <w:titlePg/>
       <w:docGrid w:linePitch="360"/>
     </w:sectPr>
   </w:body>
 </w:document>
+</file>
+
+<file path=word/footer1.xml><?xml version="1.0" encoding="utf-8"?>
+<w:ftr xmlns:m="http://schemas.openxmlformats.org/officeDocument/2006/math" xmlns:mc="http://schemas.openxmlformats.org/markup-compatibility/2006" xmlns:mo="http://schemas.microsoft.com/office/mac/office/2008/main" xmlns:mv="urn:schemas-microsoft-com:mac:vml" xmlns:o="urn:schemas-microsoft-com:office:office" xmlns:r="http://schemas.openxmlformats.org/officeDocument/2006/relationships" xmlns:v="urn:schemas-microsoft-com:vml" xmlns:w10="urn:schemas-microsoft-com:office:word" xmlns:w14="http://schemas.microsoft.com/office/word/2010/wordml" xmlns:w="http://schemas.openxmlformats.org/wordprocessingml/2006/main" xmlns:wne="http://schemas.microsoft.com/office/word/2006/wordml" xmlns:wp14="http://schemas.microsoft.com/office/word/2010/wordprocessingDrawing" xmlns:wp="http://schemas.openxmlformats.org/drawingml/2006/wordprocessingDrawing" xmlns:wpc="http://schemas.microsoft.com/office/word/2010/wordprocessingCanvas" xmlns:wpg="http://schemas.microsoft.com/office/word/2010/wordprocessingGroup" xmlns:wpi="http://schemas.microsoft.com/office/word/2010/wordprocessingInk" xmlns:wps="http://schemas.microsoft.com/office/word/2010/wordprocessingShape" mc:Ignorable="w14 wp14">
+  <w:p>
+    <w:pPr>
+      <w:pStyle w:val="Footer"/>
+      <w:jc w:val="center"/>
+    </w:pPr>
+    <w:r>
+      <w:rPr>
+        <w:color w:val="5F6A6A"/>
+        <w:sz w:val="18"/>
+      </w:rPr>
+      <w:t xml:space="preserve">Adaptive Traffic Signals Pilot  —  Page </w:t>
+    </w:r>
+    <w:r>
+      <w:rPr>
+        <w:color w:val="5F6A6A"/>
+        <w:sz w:val="18"/>
+      </w:rPr>
+      <w:fldChar w:fldCharType="begin"/>
+    </w:r>
+    <w:r>
+      <w:rPr>
+        <w:color w:val="5F6A6A"/>
+        <w:sz w:val="18"/>
+      </w:rPr>
+      <w:instrText xml:space="preserve"> PAGE </w:instrText>
+    </w:r>
+    <w:r>
+      <w:rPr>
+        <w:color w:val="5F6A6A"/>
+        <w:sz w:val="18"/>
+      </w:rPr>
+      <w:fldChar w:fldCharType="end"/>
+    </w:r>
+    <w:r>
+      <w:rPr>
+        <w:color w:val="5F6A6A"/>
+        <w:sz w:val="18"/>
+      </w:rPr>
+      <w:t xml:space="preserve"> of </w:t>
+    </w:r>
+    <w:r>
+      <w:rPr>
+        <w:color w:val="5F6A6A"/>
+        <w:sz w:val="18"/>
+      </w:rPr>
+      <w:fldChar w:fldCharType="begin"/>
+    </w:r>
+    <w:r>
+      <w:rPr>
+        <w:color w:val="5F6A6A"/>
+        <w:sz w:val="18"/>
+      </w:rPr>
+      <w:instrText xml:space="preserve"> NUMPAGES </w:instrText>
+    </w:r>
+    <w:r>
+      <w:rPr>
+        <w:color w:val="5F6A6A"/>
+        <w:sz w:val="18"/>
+      </w:rPr>
+      <w:fldChar w:fldCharType="end"/>
+    </w:r>
+  </w:p>
+</w:ftr>
 </file>
 
 <file path=word/numbering.xml><?xml version="1.0" encoding="utf-8"?>

</xml_diff>

<commit_message>
Proposal v3: Inter typography + 15 Turkish language fixes
Adopted the safe part of the external redesign — Inter body/heading
typography (available natively in Google Docs, unlike the redesign's
Inter Display / Liberation Mono) — while keeping the signal-green
identity and the labeled page-number footers the redesign had dropped.

Turkish fixes applied in place to the DeepL translation: the 'cross
green' safety-sequence mistranslation (karşı yönün yeşili), switch
counters (geçiş sayaçları), contents/heading title mismatches, the
duplicated 'Algılama' table label (Algı bölgeleri), Durum/Vaka and
Kaynakça naming consistency, debounce terminology unified, CPU fallback
wording, hardware-in-the-loop (HIL), the tangled 45-second fairness
sentence, and minor polish.

Co-Authored-By: Claude Fable 5 <noreply@anthropic.com>
Claude-Session: https://claude.ai/code/session_0159dhhnJ6cFi6rrwV8XwqLF
</commit_message>
<xml_diff>
--- a/docs/Smart_Traffic_Pilot_Proposal.docx
+++ b/docs/Smart_Traffic_Pilot_Proposal.docx
@@ -4925,7 +4925,7 @@
       <w:spacing w:after="160" w:line="276" w:lineRule="auto"/>
     </w:pPr>
     <w:rPr>
-      <w:rFonts w:ascii="Georgia" w:hAnsi="Georgia"/>
+      <w:rFonts w:ascii="Inter" w:hAnsi="Inter"/>
       <w:color w:val="212121"/>
       <w:sz w:val="22"/>
     </w:rPr>
@@ -4989,7 +4989,7 @@
       <w:outlineLvl w:val="0"/>
     </w:pPr>
     <w:rPr>
-      <w:rFonts w:asciiTheme="majorHAnsi" w:eastAsiaTheme="majorEastAsia" w:hAnsiTheme="majorHAnsi" w:cstheme="majorBidi" w:ascii="Georgia" w:hAnsi="Georgia"/>
+      <w:rFonts w:asciiTheme="majorHAnsi" w:eastAsiaTheme="majorEastAsia" w:hAnsiTheme="majorHAnsi" w:cstheme="majorBidi" w:ascii="Inter" w:hAnsi="Inter"/>
       <w:b/>
       <w:bCs/>
       <w:color w:val="1A5E20"/>
@@ -5013,7 +5013,7 @@
       <w:outlineLvl w:val="1"/>
     </w:pPr>
     <w:rPr>
-      <w:rFonts w:asciiTheme="majorHAnsi" w:eastAsiaTheme="majorEastAsia" w:hAnsiTheme="majorHAnsi" w:cstheme="majorBidi" w:ascii="Georgia" w:hAnsi="Georgia"/>
+      <w:rFonts w:asciiTheme="majorHAnsi" w:eastAsiaTheme="majorEastAsia" w:hAnsiTheme="majorHAnsi" w:cstheme="majorBidi" w:ascii="Inter" w:hAnsi="Inter"/>
       <w:b/>
       <w:bCs/>
       <w:color w:val="1A5E20"/>
@@ -5037,7 +5037,7 @@
       <w:outlineLvl w:val="2"/>
     </w:pPr>
     <w:rPr>
-      <w:rFonts w:asciiTheme="majorHAnsi" w:eastAsiaTheme="majorEastAsia" w:hAnsiTheme="majorHAnsi" w:cstheme="majorBidi" w:ascii="Georgia" w:hAnsi="Georgia"/>
+      <w:rFonts w:asciiTheme="majorHAnsi" w:eastAsiaTheme="majorEastAsia" w:hAnsiTheme="majorHAnsi" w:cstheme="majorBidi" w:ascii="Inter" w:hAnsi="Inter"/>
       <w:b/>
       <w:bCs/>
       <w:color w:val="212121"/>

</xml_diff>